<commit_message>
docs: alignement stack (Spring Boot + React Native + Angular) + matrice cours-projet
</commit_message>
<xml_diff>
--- a/docs/ASAP_CCT_v2.0_diagrammes.docx
+++ b/docs/ASAP_CCT_v2.0_diagrammes.docx
@@ -11836,7 +11836,7 @@
         <w:t>client</w:t>
       </w:r>
       <w:r>
-        <w:t xml:space="preserve"> — Flutter (iOS 13+ &amp; Android 8+).</w:t>
+        <w:t xml:space="preserve"> — React Native (iOS 13+ &amp; Android 8+).</w:t>
       </w:r>
     </w:p>
     <w:p>
@@ -11858,7 +11858,7 @@
         <w:t>livreur</w:t>
       </w:r>
       <w:r>
-        <w:t xml:space="preserve"> — Flutter (iOS 13+ &amp; Android 8+), offline-first.</w:t>
+        <w:t xml:space="preserve"> — React Native (iOS 13+ &amp; Android 8+), offline-first.</w:t>
       </w:r>
     </w:p>
     <w:p>
@@ -11906,7 +11906,7 @@
         <w:t>Dashboard web</w:t>
       </w:r>
       <w:r>
-        <w:t xml:space="preserve"> super admin + co-admins — Next.js 14 / React.</w:t>
+        <w:t xml:space="preserve"> super admin + co-admins — Angular 17 (SPA).</w:t>
       </w:r>
     </w:p>
     <w:p>
@@ -11925,7 +11925,7 @@
         <w:t>API backend</w:t>
       </w:r>
       <w:r>
-        <w:t xml:space="preserve"> — NestJS/TypeScript, modules : Auth, Utilisateurs, Livraisons, Tournées, Paiements, Facturation, Notifications, Chat, Partenaires, Ramassage, B2B, Promotions, Rémunérations, Admin, Audit.</w:t>
+        <w:t xml:space="preserve"> — Spring Boot / Java, modules : Auth, Utilisateurs, Livraisons, Tournées, Paiements, Facturation, Notifications, Chat, Partenaires, Ramassage, B2B, Promotions, Rémunérations, Admin, Audit.</w:t>
       </w:r>
     </w:p>
     <w:p>
@@ -14786,7 +14786,7 @@
         <w:pStyle w:val="FirstParagraph"/>
       </w:pPr>
       <w:r>
-        <w:t>Postes de travail (16 Go RAM recommandé) ; smartphones Android 8+ / iOS 13+ ; connexion ≥ 10 Mbps ; VS Code (+ extensions) ; Git/GitHub Actions ; Docker ; Flutter/Dart, NestJS/TypeScript, Next.js, FastAPI/Python, OR-Tools, Grafana+Loki ; Mapbox (+ Google Maps secours) ; Figma ; ClamAV.</w:t>
+        <w:t>Postes de travail (16 Go RAM recommandé) ; smartphones Android 8+ / iOS 13+ ; connexion ≥ 10 Mbps ; VS Code (+ extensions) ; Git/GitHub Actions ; Docker ; React Native, Spring Boot/Java, Angular, FastAPI/Python, OR-Tools, Grafana+Loki ; Mapbox (+ Google Maps secours) ; Figma ; ClamAV.</w:t>
       </w:r>
     </w:p>
     <w:p>

</xml_diff>